<commit_message>
docs: sederhanakan tabel anggota kelompok pada cover workbook
</commit_message>
<xml_diff>
--- a/docs/Workbook_Praktikum_01_Flutter_StudyLog_IFB5J.docx
+++ b/docs/Workbook_Praktikum_01_Flutter_StudyLog_IFB5J.docx
@@ -143,22 +143,21 @@
         </w:tblBorders>
       </w:tblPr>
       <w:tblGrid>
-        <w:gridCol w:w="2324"/>
-        <w:gridCol w:w="2324"/>
-        <w:gridCol w:w="2324"/>
-        <w:gridCol w:w="2324"/>
+        <w:gridCol w:w="3099"/>
+        <w:gridCol w:w="3099"/>
+        <w:gridCol w:w="3099"/>
       </w:tblGrid>
       <w:tr>
         <w:tc>
           <w:tcPr>
-            <w:tcW w:type="dxa" w:w="680"/>
+            <w:tcW w:type="dxa" w:w="907"/>
             <w:vAlign w:val="center"/>
             <w:shd w:fill="233F74"/>
             <w:tcMar>
               <w:top w:w="120" w:type="dxa"/>
               <w:bottom w:w="120" w:type="dxa"/>
-              <w:left w:w="120" w:type="dxa"/>
-              <w:right w:w="120" w:type="dxa"/>
+              <w:left w:w="140" w:type="dxa"/>
+              <w:right w:w="140" w:type="dxa"/>
             </w:tcMar>
           </w:tcPr>
           <w:p>
@@ -180,14 +179,14 @@
         </w:tc>
         <w:tc>
           <w:tcPr>
-            <w:tcW w:type="dxa" w:w="3288"/>
+            <w:tcW w:type="dxa" w:w="5443"/>
             <w:vAlign w:val="center"/>
             <w:shd w:fill="233F74"/>
             <w:tcMar>
               <w:top w:w="120" w:type="dxa"/>
               <w:bottom w:w="120" w:type="dxa"/>
-              <w:left w:w="120" w:type="dxa"/>
-              <w:right w:w="120" w:type="dxa"/>
+              <w:left w:w="140" w:type="dxa"/>
+              <w:right w:w="140" w:type="dxa"/>
             </w:tcMar>
           </w:tcPr>
           <w:p>
@@ -209,14 +208,14 @@
         </w:tc>
         <w:tc>
           <w:tcPr>
-            <w:tcW w:type="dxa" w:w="1587"/>
+            <w:tcW w:type="dxa" w:w="2721"/>
             <w:vAlign w:val="center"/>
             <w:shd w:fill="233F74"/>
             <w:tcMar>
               <w:top w:w="120" w:type="dxa"/>
               <w:bottom w:w="120" w:type="dxa"/>
-              <w:left w:w="120" w:type="dxa"/>
-              <w:right w:w="120" w:type="dxa"/>
+              <w:left w:w="140" w:type="dxa"/>
+              <w:right w:w="140" w:type="dxa"/>
             </w:tcMar>
           </w:tcPr>
           <w:p>
@@ -236,16 +235,47 @@
             </w:r>
           </w:p>
         </w:tc>
+      </w:tr>
+      <w:tr>
         <w:tc>
           <w:tcPr>
-            <w:tcW w:type="dxa" w:w="3515"/>
+            <w:tcW w:type="dxa" w:w="907"/>
             <w:vAlign w:val="center"/>
-            <w:shd w:fill="233F74"/>
+            <w:shd w:fill="FAFBFD"/>
             <w:tcMar>
-              <w:top w:w="120" w:type="dxa"/>
-              <w:bottom w:w="120" w:type="dxa"/>
-              <w:left w:w="120" w:type="dxa"/>
-              <w:right w:w="120" w:type="dxa"/>
+              <w:top w:w="115" w:type="dxa"/>
+              <w:bottom w:w="115" w:type="dxa"/>
+              <w:left w:w="140" w:type="dxa"/>
+              <w:right w:w="140" w:type="dxa"/>
+            </w:tcMar>
+          </w:tcPr>
+          <w:p>
+            <w:pPr>
+              <w:spacing w:before="40" w:after="40" w:line="276" w:lineRule="auto"/>
+              <w:jc w:val="center"/>
+            </w:pPr>
+            <w:r/>
+            <w:r>
+              <w:rPr>
+                <w:rFonts w:ascii="Times New Roman" w:hAnsi="Times New Roman"/>
+                <w:b w:val="0"/>
+                <w:color w:val="1E293B"/>
+                <w:sz w:val="22"/>
+              </w:rPr>
+              <w:t>1</w:t>
+            </w:r>
+          </w:p>
+        </w:tc>
+        <w:tc>
+          <w:tcPr>
+            <w:tcW w:type="dxa" w:w="5443"/>
+            <w:vAlign w:val="center"/>
+            <w:shd w:fill="FAFBFD"/>
+            <w:tcMar>
+              <w:top w:w="115" w:type="dxa"/>
+              <w:bottom w:w="115" w:type="dxa"/>
+              <w:left w:w="140" w:type="dxa"/>
+              <w:right w:w="140" w:type="dxa"/>
             </w:tcMar>
           </w:tcPr>
           <w:p>
@@ -258,25 +288,23 @@
               <w:rPr>
                 <w:rFonts w:ascii="Times New Roman" w:hAnsi="Times New Roman"/>
                 <w:b/>
-                <w:color w:val="FFFFFF"/>
-                <w:sz w:val="21"/>
-              </w:rPr>
-              <w:t>Peran &amp; Kontribusi</w:t>
+                <w:color w:val="1E293B"/>
+                <w:sz w:val="22"/>
+              </w:rPr>
+              <w:t>Ryanda Hermawan</w:t>
             </w:r>
           </w:p>
         </w:tc>
-      </w:tr>
-      <w:tr>
         <w:tc>
           <w:tcPr>
-            <w:tcW w:type="dxa" w:w="680"/>
+            <w:tcW w:type="dxa" w:w="2721"/>
             <w:vAlign w:val="center"/>
             <w:shd w:fill="FAFBFD"/>
             <w:tcMar>
-              <w:top w:w="110" w:type="dxa"/>
-              <w:bottom w:w="110" w:type="dxa"/>
-              <w:left w:w="120" w:type="dxa"/>
-              <w:right w:w="120" w:type="dxa"/>
+              <w:top w:w="115" w:type="dxa"/>
+              <w:bottom w:w="115" w:type="dxa"/>
+              <w:left w:w="140" w:type="dxa"/>
+              <w:right w:w="140" w:type="dxa"/>
             </w:tcMar>
           </w:tcPr>
           <w:p>
@@ -290,22 +318,53 @@
                 <w:rFonts w:ascii="Times New Roman" w:hAnsi="Times New Roman"/>
                 <w:b w:val="0"/>
                 <w:color w:val="1E293B"/>
-                <w:sz w:val="21"/>
-              </w:rPr>
-              <w:t>1</w:t>
+                <w:sz w:val="22"/>
+              </w:rPr>
+              <w:t>2411068</w:t>
+            </w:r>
+          </w:p>
+        </w:tc>
+      </w:tr>
+      <w:tr>
+        <w:tc>
+          <w:tcPr>
+            <w:tcW w:type="dxa" w:w="907"/>
+            <w:vAlign w:val="center"/>
+            <w:shd w:fill="FFFFFF"/>
+            <w:tcMar>
+              <w:top w:w="115" w:type="dxa"/>
+              <w:bottom w:w="115" w:type="dxa"/>
+              <w:left w:w="140" w:type="dxa"/>
+              <w:right w:w="140" w:type="dxa"/>
+            </w:tcMar>
+          </w:tcPr>
+          <w:p>
+            <w:pPr>
+              <w:spacing w:before="40" w:after="40" w:line="276" w:lineRule="auto"/>
+              <w:jc w:val="center"/>
+            </w:pPr>
+            <w:r/>
+            <w:r>
+              <w:rPr>
+                <w:rFonts w:ascii="Times New Roman" w:hAnsi="Times New Roman"/>
+                <w:b w:val="0"/>
+                <w:color w:val="1E293B"/>
+                <w:sz w:val="22"/>
+              </w:rPr>
+              <w:t>2</w:t>
             </w:r>
           </w:p>
         </w:tc>
         <w:tc>
           <w:tcPr>
-            <w:tcW w:type="dxa" w:w="3288"/>
+            <w:tcW w:type="dxa" w:w="5443"/>
             <w:vAlign w:val="center"/>
-            <w:shd w:fill="FAFBFD"/>
+            <w:shd w:fill="FFFFFF"/>
             <w:tcMar>
-              <w:top w:w="110" w:type="dxa"/>
-              <w:bottom w:w="110" w:type="dxa"/>
-              <w:left w:w="120" w:type="dxa"/>
-              <w:right w:w="120" w:type="dxa"/>
+              <w:top w:w="115" w:type="dxa"/>
+              <w:bottom w:w="115" w:type="dxa"/>
+              <w:left w:w="140" w:type="dxa"/>
+              <w:right w:w="140" w:type="dxa"/>
             </w:tcMar>
           </w:tcPr>
           <w:p>
@@ -319,22 +378,22 @@
                 <w:rFonts w:ascii="Times New Roman" w:hAnsi="Times New Roman"/>
                 <w:b/>
                 <w:color w:val="1E293B"/>
-                <w:sz w:val="21"/>
-              </w:rPr>
-              <w:t>Ryanda Hermawan</w:t>
+                <w:sz w:val="22"/>
+              </w:rPr>
+              <w:t>Dewi Nofitta Sari</w:t>
             </w:r>
           </w:p>
         </w:tc>
         <w:tc>
           <w:tcPr>
-            <w:tcW w:type="dxa" w:w="1587"/>
+            <w:tcW w:type="dxa" w:w="2721"/>
             <w:vAlign w:val="center"/>
-            <w:shd w:fill="FAFBFD"/>
+            <w:shd w:fill="FFFFFF"/>
             <w:tcMar>
-              <w:top w:w="110" w:type="dxa"/>
-              <w:bottom w:w="110" w:type="dxa"/>
-              <w:left w:w="120" w:type="dxa"/>
-              <w:right w:w="120" w:type="dxa"/>
+              <w:top w:w="115" w:type="dxa"/>
+              <w:bottom w:w="115" w:type="dxa"/>
+              <w:left w:w="140" w:type="dxa"/>
+              <w:right w:w="140" w:type="dxa"/>
             </w:tcMar>
           </w:tcPr>
           <w:p>
@@ -348,22 +407,53 @@
                 <w:rFonts w:ascii="Times New Roman" w:hAnsi="Times New Roman"/>
                 <w:b w:val="0"/>
                 <w:color w:val="1E293B"/>
-                <w:sz w:val="21"/>
-              </w:rPr>
-              <w:t>2411068</w:t>
+                <w:sz w:val="22"/>
+              </w:rPr>
+              <w:t>2411065</w:t>
+            </w:r>
+          </w:p>
+        </w:tc>
+      </w:tr>
+      <w:tr>
+        <w:tc>
+          <w:tcPr>
+            <w:tcW w:type="dxa" w:w="907"/>
+            <w:vAlign w:val="center"/>
+            <w:shd w:fill="FAFBFD"/>
+            <w:tcMar>
+              <w:top w:w="115" w:type="dxa"/>
+              <w:bottom w:w="115" w:type="dxa"/>
+              <w:left w:w="140" w:type="dxa"/>
+              <w:right w:w="140" w:type="dxa"/>
+            </w:tcMar>
+          </w:tcPr>
+          <w:p>
+            <w:pPr>
+              <w:spacing w:before="40" w:after="40" w:line="276" w:lineRule="auto"/>
+              <w:jc w:val="center"/>
+            </w:pPr>
+            <w:r/>
+            <w:r>
+              <w:rPr>
+                <w:rFonts w:ascii="Times New Roman" w:hAnsi="Times New Roman"/>
+                <w:b w:val="0"/>
+                <w:color w:val="1E293B"/>
+                <w:sz w:val="22"/>
+              </w:rPr>
+              <w:t>3</w:t>
             </w:r>
           </w:p>
         </w:tc>
         <w:tc>
           <w:tcPr>
-            <w:tcW w:type="dxa" w:w="3515"/>
+            <w:tcW w:type="dxa" w:w="5443"/>
             <w:vAlign w:val="center"/>
             <w:shd w:fill="FAFBFD"/>
             <w:tcMar>
-              <w:top w:w="110" w:type="dxa"/>
-              <w:bottom w:w="110" w:type="dxa"/>
-              <w:left w:w="120" w:type="dxa"/>
-              <w:right w:w="120" w:type="dxa"/>
+              <w:top w:w="115" w:type="dxa"/>
+              <w:bottom w:w="115" w:type="dxa"/>
+              <w:left w:w="140" w:type="dxa"/>
+              <w:right w:w="140" w:type="dxa"/>
             </w:tcMar>
           </w:tcPr>
           <w:p>
@@ -375,26 +465,24 @@
             <w:r>
               <w:rPr>
                 <w:rFonts w:ascii="Times New Roman" w:hAnsi="Times New Roman"/>
-                <w:b w:val="0"/>
+                <w:b/>
                 <w:color w:val="1E293B"/>
-                <w:sz w:val="21"/>
-              </w:rPr>
-              <w:t>Arsitektur SQLite 3 Tabel Relasional &amp; Git</w:t>
+                <w:sz w:val="22"/>
+              </w:rPr>
+              <w:t>Bintang Sahda Rayyu Sonora</w:t>
             </w:r>
           </w:p>
         </w:tc>
-      </w:tr>
-      <w:tr>
         <w:tc>
           <w:tcPr>
-            <w:tcW w:type="dxa" w:w="680"/>
+            <w:tcW w:type="dxa" w:w="2721"/>
             <w:vAlign w:val="center"/>
-            <w:shd w:fill="FFFFFF"/>
+            <w:shd w:fill="FAFBFD"/>
             <w:tcMar>
-              <w:top w:w="110" w:type="dxa"/>
-              <w:bottom w:w="110" w:type="dxa"/>
-              <w:left w:w="120" w:type="dxa"/>
-              <w:right w:w="120" w:type="dxa"/>
+              <w:top w:w="115" w:type="dxa"/>
+              <w:bottom w:w="115" w:type="dxa"/>
+              <w:left w:w="140" w:type="dxa"/>
+              <w:right w:w="140" w:type="dxa"/>
             </w:tcMar>
           </w:tcPr>
           <w:p>
@@ -408,214 +496,9 @@
                 <w:rFonts w:ascii="Times New Roman" w:hAnsi="Times New Roman"/>
                 <w:b w:val="0"/>
                 <w:color w:val="1E293B"/>
-                <w:sz w:val="21"/>
-              </w:rPr>
-              <w:t>2</w:t>
-            </w:r>
-          </w:p>
-        </w:tc>
-        <w:tc>
-          <w:tcPr>
-            <w:tcW w:type="dxa" w:w="3288"/>
-            <w:vAlign w:val="center"/>
-            <w:shd w:fill="FFFFFF"/>
-            <w:tcMar>
-              <w:top w:w="110" w:type="dxa"/>
-              <w:bottom w:w="110" w:type="dxa"/>
-              <w:left w:w="120" w:type="dxa"/>
-              <w:right w:w="120" w:type="dxa"/>
-            </w:tcMar>
-          </w:tcPr>
-          <w:p>
-            <w:pPr>
-              <w:spacing w:before="40" w:after="40" w:line="276" w:lineRule="auto"/>
-              <w:jc w:val="left"/>
-            </w:pPr>
-            <w:r/>
-            <w:r>
-              <w:rPr>
-                <w:rFonts w:ascii="Times New Roman" w:hAnsi="Times New Roman"/>
-                <w:b/>
-                <w:color w:val="1E293B"/>
-                <w:sz w:val="21"/>
-              </w:rPr>
-              <w:t>Dewi Nofitta Sari</w:t>
-            </w:r>
-          </w:p>
-        </w:tc>
-        <w:tc>
-          <w:tcPr>
-            <w:tcW w:type="dxa" w:w="1587"/>
-            <w:vAlign w:val="center"/>
-            <w:shd w:fill="FFFFFF"/>
-            <w:tcMar>
-              <w:top w:w="110" w:type="dxa"/>
-              <w:bottom w:w="110" w:type="dxa"/>
-              <w:left w:w="120" w:type="dxa"/>
-              <w:right w:w="120" w:type="dxa"/>
-            </w:tcMar>
-          </w:tcPr>
-          <w:p>
-            <w:pPr>
-              <w:spacing w:before="40" w:after="40" w:line="276" w:lineRule="auto"/>
-              <w:jc w:val="center"/>
-            </w:pPr>
-            <w:r/>
-            <w:r>
-              <w:rPr>
-                <w:rFonts w:ascii="Times New Roman" w:hAnsi="Times New Roman"/>
-                <w:b w:val="0"/>
-                <w:color w:val="1E293B"/>
-                <w:sz w:val="21"/>
-              </w:rPr>
-              <w:t>2411065</w:t>
-            </w:r>
-          </w:p>
-        </w:tc>
-        <w:tc>
-          <w:tcPr>
-            <w:tcW w:type="dxa" w:w="3515"/>
-            <w:vAlign w:val="center"/>
-            <w:shd w:fill="FFFFFF"/>
-            <w:tcMar>
-              <w:top w:w="110" w:type="dxa"/>
-              <w:bottom w:w="110" w:type="dxa"/>
-              <w:left w:w="120" w:type="dxa"/>
-              <w:right w:w="120" w:type="dxa"/>
-            </w:tcMar>
-          </w:tcPr>
-          <w:p>
-            <w:pPr>
-              <w:spacing w:before="40" w:after="40" w:line="276" w:lineRule="auto"/>
-              <w:jc w:val="left"/>
-            </w:pPr>
-            <w:r/>
-            <w:r>
-              <w:rPr>
-                <w:rFonts w:ascii="Times New Roman" w:hAnsi="Times New Roman"/>
-                <w:b w:val="0"/>
-                <w:color w:val="1E293B"/>
-                <w:sz w:val="21"/>
-              </w:rPr>
-              <w:t>Antarmuka Multi-Layar, Form &amp; State Provider</w:t>
-            </w:r>
-          </w:p>
-        </w:tc>
-      </w:tr>
-      <w:tr>
-        <w:tc>
-          <w:tcPr>
-            <w:tcW w:type="dxa" w:w="680"/>
-            <w:vAlign w:val="center"/>
-            <w:shd w:fill="FAFBFD"/>
-            <w:tcMar>
-              <w:top w:w="110" w:type="dxa"/>
-              <w:bottom w:w="110" w:type="dxa"/>
-              <w:left w:w="120" w:type="dxa"/>
-              <w:right w:w="120" w:type="dxa"/>
-            </w:tcMar>
-          </w:tcPr>
-          <w:p>
-            <w:pPr>
-              <w:spacing w:before="40" w:after="40" w:line="276" w:lineRule="auto"/>
-              <w:jc w:val="center"/>
-            </w:pPr>
-            <w:r/>
-            <w:r>
-              <w:rPr>
-                <w:rFonts w:ascii="Times New Roman" w:hAnsi="Times New Roman"/>
-                <w:b w:val="0"/>
-                <w:color w:val="1E293B"/>
-                <w:sz w:val="21"/>
-              </w:rPr>
-              <w:t>3</w:t>
-            </w:r>
-          </w:p>
-        </w:tc>
-        <w:tc>
-          <w:tcPr>
-            <w:tcW w:type="dxa" w:w="3288"/>
-            <w:vAlign w:val="center"/>
-            <w:shd w:fill="FAFBFD"/>
-            <w:tcMar>
-              <w:top w:w="110" w:type="dxa"/>
-              <w:bottom w:w="110" w:type="dxa"/>
-              <w:left w:w="120" w:type="dxa"/>
-              <w:right w:w="120" w:type="dxa"/>
-            </w:tcMar>
-          </w:tcPr>
-          <w:p>
-            <w:pPr>
-              <w:spacing w:before="40" w:after="40" w:line="276" w:lineRule="auto"/>
-              <w:jc w:val="left"/>
-            </w:pPr>
-            <w:r/>
-            <w:r>
-              <w:rPr>
-                <w:rFonts w:ascii="Times New Roman" w:hAnsi="Times New Roman"/>
-                <w:b/>
-                <w:color w:val="1E293B"/>
-                <w:sz w:val="21"/>
-              </w:rPr>
-              <w:t>Bintang Sahda Rayyu Sonora</w:t>
-            </w:r>
-          </w:p>
-        </w:tc>
-        <w:tc>
-          <w:tcPr>
-            <w:tcW w:type="dxa" w:w="1587"/>
-            <w:vAlign w:val="center"/>
-            <w:shd w:fill="FAFBFD"/>
-            <w:tcMar>
-              <w:top w:w="110" w:type="dxa"/>
-              <w:bottom w:w="110" w:type="dxa"/>
-              <w:left w:w="120" w:type="dxa"/>
-              <w:right w:w="120" w:type="dxa"/>
-            </w:tcMar>
-          </w:tcPr>
-          <w:p>
-            <w:pPr>
-              <w:spacing w:before="40" w:after="40" w:line="276" w:lineRule="auto"/>
-              <w:jc w:val="center"/>
-            </w:pPr>
-            <w:r/>
-            <w:r>
-              <w:rPr>
-                <w:rFonts w:ascii="Times New Roman" w:hAnsi="Times New Roman"/>
-                <w:b w:val="0"/>
-                <w:color w:val="1E293B"/>
-                <w:sz w:val="21"/>
+                <w:sz w:val="22"/>
               </w:rPr>
               <w:t>2411025</w:t>
-            </w:r>
-          </w:p>
-        </w:tc>
-        <w:tc>
-          <w:tcPr>
-            <w:tcW w:type="dxa" w:w="3515"/>
-            <w:vAlign w:val="center"/>
-            <w:shd w:fill="FAFBFD"/>
-            <w:tcMar>
-              <w:top w:w="110" w:type="dxa"/>
-              <w:bottom w:w="110" w:type="dxa"/>
-              <w:left w:w="120" w:type="dxa"/>
-              <w:right w:w="120" w:type="dxa"/>
-            </w:tcMar>
-          </w:tcPr>
-          <w:p>
-            <w:pPr>
-              <w:spacing w:before="40" w:after="40" w:line="276" w:lineRule="auto"/>
-              <w:jc w:val="left"/>
-            </w:pPr>
-            <w:r/>
-            <w:r>
-              <w:rPr>
-                <w:rFonts w:ascii="Times New Roman" w:hAnsi="Times New Roman"/>
-                <w:b w:val="0"/>
-                <w:color w:val="1E293B"/>
-                <w:sz w:val="21"/>
-              </w:rPr>
-              <w:t>Pengujian Sistem, Video Demo &amp; Dokumentasi</w:t>
             </w:r>
           </w:p>
         </w:tc>

</xml_diff>